<commit_message>
docs: lien du dépôt GitHub dans le README et la copie à rendre
</commit_message>
<xml_diff>
--- a/docs/ECF_TPDeveloppeurWebEtWebMobile_copiearendre_ELBRAIKI_Mahmoud.docx
+++ b/docs/ECF_TPDeveloppeurWebEtWebMobile_copiearendre_ELBRAIKI_Mahmoud.docx
@@ -402,21 +402,7 @@
               <w:rPr>
                 <w:sz w:val="18"/>
               </w:rPr>
-              <w:t xml:space="preserve">https://github.com/</w:t>
-            </w:r>
-            <w:r>
-              <w:rPr>
-                <w:bCs/>
-                <w:b/>
-                <w:sz w:val="18"/>
-              </w:rPr>
-              <w:t xml:space="preserve">[à compléter]</w:t>
-            </w:r>
-            <w:r>
-              <w:rPr>
-                <w:sz w:val="18"/>
-              </w:rPr>
-              <w:t xml:space="preserve">/vite-gourmand</w:t>
+              <w:t xml:space="preserve">https://github.com/mahmoud-elbraiki-dev/vite-gourmand</w:t>
             </w:r>
           </w:p>
         </w:tc>

</xml_diff>

<commit_message>
docs: liens Notion et application déployée (alwaysdata)
</commit_message>
<xml_diff>
--- a/docs/ECF_TPDeveloppeurWebEtWebMobile_copiearendre_ELBRAIKI_Mahmoud.docx
+++ b/docs/ECF_TPDeveloppeurWebEtWebMobile_copiearendre_ELBRAIKI_Mahmoud.docx
@@ -434,21 +434,7 @@
               <w:rPr>
                 <w:sz w:val="18"/>
               </w:rPr>
-              <w:t xml:space="preserve">https://</w:t>
-            </w:r>
-            <w:r>
-              <w:rPr>
-                <w:bCs/>
-                <w:b/>
-                <w:sz w:val="18"/>
-              </w:rPr>
-              <w:t xml:space="preserve">[à compléter]</w:t>
-            </w:r>
-            <w:r>
-              <w:rPr>
-                <w:sz w:val="18"/>
-              </w:rPr>
-              <w:t xml:space="preserve">.fly.dev</w:t>
+              <w:t xml:space="preserve">https://elbraiki.alwaysdata.net</w:t>
             </w:r>
           </w:p>
         </w:tc>
@@ -478,11 +464,9 @@
             </w:pPr>
             <w:r>
               <w:rPr>
-                <w:bCs/>
-                <w:b/>
-                <w:sz w:val="18"/>
-              </w:rPr>
-              <w:t xml:space="preserve">[à compléter]</w:t>
+                <w:sz w:val="18"/>
+              </w:rPr>
+              <w:t xml:space="preserve">https://hungry-scion-203.notion.site/3f846f0458668047951be85e7a979797?v=3f846f045866804db957000cd87cca5d</w:t>
             </w:r>
           </w:p>
         </w:tc>
@@ -2071,7 +2055,7 @@
               <w:rPr>
                 <w:sz w:val="18"/>
               </w:rPr>
-              <w:t xml:space="preserve">Docker + Fly.io ; mesures RGAA détaillées dans la documentation technique</w:t>
+              <w:t xml:space="preserve">Mise en ligne sur alwaysdata (configuration Docker + Fly.io également fournie) ; mesures RGAA détaillées dans la documentation technique</w:t>
             </w:r>
           </w:p>
         </w:tc>
@@ -10975,7 +10959,25 @@
         <w:pStyle w:val="FirstParagraph"/>
       </w:pPr>
       <w:r>
-        <w:t xml:space="preserve">L’application est déployée sous forme d’</w:t>
+        <w:t xml:space="preserve">Mise en ligne effective : l’application de production est hébergée sur </w:t>
+      </w:r>
+      <w:r>
+        <w:rPr>
+          <w:bCs/>
+          <w:b/>
+        </w:rPr>
+        <w:t xml:space="preserve">alwaysdata</w:t>
+      </w:r>
+      <w:r>
+        <w:t xml:space="preserve"> (hébergement mutualisé, PHP 8.3, MariaDB) à l’adresse https://elbraiki.alwaysdata.net. Procédure suivie : clonage du dépôt GitHub en SSH dans ~/www, racine du site pointée sur public/, création du fichier .env sur le serveur (identifiants hors dépôt), import des scripts SQL dans la base elbraiki_ecf, puis php bin/sync-nosql.php pour initialiser la base NoSQL (repli documentaire JSON, MongoDB n’étant pas proposé par l’hébergeur). Mises à jour : git pull dans ~/www/vite-gourmand après merge de develop dans main.</w:t>
+      </w:r>
+    </w:p>
+    <w:p>
+      <w:pPr>
+        <w:pStyle w:val="BodyText"/>
+      </w:pPr>
+      <w:r>
+        <w:t xml:space="preserve">Le dépôt permet également un déploiement conteneurisé sous forme d’</w:t>
       </w:r>
       <w:r>
         <w:rPr>

</xml_diff>